<commit_message>
Updated "Assigned To" Section
Updated "Assigned To" Section
</commit_message>
<xml_diff>
--- a/docs/Product_Backlog_and_Sprint_Plan.docx
+++ b/docs/Product_Backlog_and_Sprint_Plan.docx
@@ -78,15 +78,7 @@
           <w:i/>
           <w:iCs/>
         </w:rPr>
-        <w:t xml:space="preserve"> </w:t>
-      </w:r>
-      <w:r>
-        <w:rPr>
-          <w:rFonts w:ascii="Arial" w:hAnsi="Arial" w:cs="Arial"/>
-          <w:i/>
-          <w:iCs/>
-        </w:rPr>
-        <w:t>Bandara</w:t>
+        <w:t xml:space="preserve"> Bandara</w:t>
       </w:r>
     </w:p>
     <w:p>
@@ -314,6 +306,12 @@
                 <w:rFonts w:ascii="Arial" w:hAnsi="Arial" w:cs="Arial"/>
               </w:rPr>
               <w:t>Patryk</w:t>
+            </w:r>
+            <w:r>
+              <w:rPr>
+                <w:rFonts w:ascii="Arial" w:hAnsi="Arial" w:cs="Arial"/>
+              </w:rPr>
+              <w:t xml:space="preserve"> / Grace</w:t>
             </w:r>
           </w:p>
         </w:tc>

</xml_diff>